<commit_message>
Bổ sung cam kết không phát sinh tranh chấp giữa Bên A và Bên B tại Ngày chuyển giao
Co-Authored-By: Claude Opus 5.5 <noreply@anthropic.com>
Claude-Session: https://claude.ai/code/session_0111U8Jqcck5scPA4qQYmL2d
</commit_message>
<xml_diff>
--- a/27.10.2026 PHU LUC SUA DOI 02 HD 140.2026 GAS D (huy.dt hoan thien).docx
+++ b/27.10.2026 PHU LUC SUA DOI 02 HD 140.2026 GAS D (huy.dt hoan thien).docx
@@ -4247,6 +4247,38 @@
             <w:lang w:val="pt-BR"/>
           </w:rPr>
           <w:t xml:space="preserve">Các Bên xác nhận: tại Ngày chuyển giao, Bên A đã hoàn thành toàn bộ quyền, nghĩa vụ và trách nhiệm của Bên Bán đối với Bên B theo Hợp đồng và Bên B đã hoàn thành toàn bộ quyền, nghĩa vụ và trách nhiệm của Bên Mua đối với Bên A theo Hợp đồng, ngoại trừ Nghĩa vụ tồn đọng.</w:t>
+        </w:r>
+      </w:ins>
+    </w:p>
+    <w:p>
+      <w:pPr>
+        <w:pStyle w:val="ListParagraph"/>
+        <w:widowControl w:val="0"/>
+        <w:numPr>
+          <w:ilvl w:val="0"/>
+          <w:numId w:val="18"/>
+        </w:numPr>
+        <w:spacing w:before="120" w:after="120" w:line="276" w:lineRule="auto"/>
+        <w:ind w:left="0" w:firstLine="567"/>
+        <w:contextualSpacing w:val="0"/>
+        <w:jc w:val="both"/>
+        <w:rPr>
+          <w:ins w:id="9801" w:author="huy.dt" w:date="2026-10-27T16:00:00Z"/>
+          <w:rFonts w:ascii="Times New Roman" w:hAnsi="Times New Roman"/>
+          <w:sz w:val="26"/>
+          <w:szCs w:val="26"/>
+          <w:lang w:val="pt-BR"/>
+        </w:rPr>
+      </w:pPr>
+      <w:ins w:id="9802" w:author="huy.dt" w:date="2026-10-27T16:00:00Z">
+        <w:r>
+          <w:rPr>
+            <w:rFonts w:ascii="Times New Roman" w:hAnsi="Times New Roman"/>
+            <w:sz w:val="26"/>
+            <w:szCs w:val="26"/>
+            <w:lang w:val="pt-BR"/>
+          </w:rPr>
+          <w:t xml:space="preserve">Các Bên cùng cam kết và bảo đảm rằng, tại Ngày chuyển giao, giữa Bên A và Bên B không có bất kỳ tranh chấp, khiếu nại, yêu cầu phạt vi phạm hoặc yêu cầu bồi thường thiệt hại nào đã phát sinh hoặc đang chờ giải quyết liên quan đến việc giao kết và thực hiện Hợp đồng. Kể từ Ngày chuyển giao, Bên A và Bên B không có quyền đưa ra bất kỳ khiếu nại, yêu cầu nào đối với Bên kia liên quan đến Hợp đồng đối với các sự kiện xảy ra trước Ngày chuyển giao, ngoại trừ các khiếu nại, yêu cầu liên quan đến Nghĩa vụ tồn đọng.</w:t>
         </w:r>
       </w:ins>
     </w:p>

</xml_diff>